<commit_message>
Redesign Figures 1 and 2 as clean native Word tables (boxes + arrows)
</commit_message>
<xml_diff>
--- a/MAJOR PROJECT - Revised.docx
+++ b/MAJOR PROJECT - Revised.docx
@@ -2861,69 +2861,458 @@
         <w:t xml:space="preserve">Figure 1 — Component and Data-Flow Architecture</w:t>
       </w:r>
     </w:p>
-    <w:p>
-      <w:pPr>
-        <w:pStyle w:val="Normal"/>
-        <w:spacing w:after="120" w:line="240" w:lineRule="auto"/>
-        <w:shd w:val="clear" w:fill="F2F2F2"/>
-      </w:pPr>
-      <w:r>
-        <w:rPr>
-          <w:rFonts w:ascii="Consolas" w:hAnsi="Consolas" w:cs="Consolas"/>
-          <w:sz w:val="16"/>
-          <w:szCs w:val="16"/>
-        </w:rPr>
-        <w:t xml:space="preserve">  +-----------------------------------------------------------+</w:t>
-        <w:br/>
-        <w:t xml:space="preserve">  |            CLIENT  (data owner / user)                    |</w:t>
-        <w:br/>
-        <w:t xml:space="preserve">  |  - AES-256-GCM file encryption      - DEK generation      |</w:t>
-        <w:br/>
-        <w:t xml:space="preserve">  |  - RSA-OAEP device key              - RSA-PSS signing     |</w:t>
-        <w:br/>
-        <w:t xml:space="preserve">  |  - Final (light) CP-ABE decryption step                   |</w:t>
-        <w:br/>
-        <w:t xml:space="preserve">  +----------------+---------------------------^--------------+</w:t>
-        <w:br/>
-        <w:t xml:space="preserve">     upload / DEK  |                           | transformed CT</w:t>
-        <w:br/>
-        <w:t xml:space="preserve">                   v                           |</w:t>
-        <w:br/>
-        <w:t xml:space="preserve">  +----------------+---------+   +--------------+--------------+</w:t>
-        <w:br/>
-        <w:t xml:space="preserve">  | Attribute Authority (AA) |   |     BACKEND (Flask REST)    |</w:t>
-        <w:br/>
-        <w:t xml:space="preserve">  |  - CP-ABE Setup          |--&gt;|  - JWT authentication       |</w:t>
-        <w:br/>
-        <w:t xml:space="preserve">  |  - Attribute key issue   |   |  - ABAC: PDP.PEP.PIP.PAP    |</w:t>
-        <w:br/>
-        <w:t xml:space="preserve">  |  - Key / attr versioning |   |  - CP-ABE wrap / outsourced |</w:t>
-        <w:br/>
-        <w:t xml:space="preserve">  |                          |   |    decryption transform     |</w:t>
-        <w:br/>
-        <w:t xml:space="preserve">  |                          |   |  - Revocation: version +    |</w:t>
-        <w:br/>
-        <w:t xml:space="preserve">  |                          |   |    lazy DEK re-wrap         |</w:t>
-        <w:br/>
-        <w:t xml:space="preserve">  +--------------------------+   +----+-------------------+----+</w:t>
-        <w:br/>
-        <w:t xml:space="preserve">                                      |                   |</w:t>
-        <w:br/>
-        <w:t xml:space="preserve">                         metadata     v                   v  ciphertext</w:t>
-        <w:br/>
-        <w:t xml:space="preserve">                    +-----------------+--+   +------------+-----------+</w:t>
-        <w:br/>
-        <w:t xml:space="preserve">                    | MongoDB            |   | Object store           |</w:t>
-        <w:br/>
-        <w:t xml:space="preserve">                    | policies, wrapped  |   | AWS S3 / Azure Blob    |</w:t>
-        <w:br/>
-        <w:t xml:space="preserve">                    | keys, versions,    |   | (presigned URLs)       |</w:t>
-        <w:br/>
-        <w:t xml:space="preserve">                    | audit log          |   |                        |</w:t>
-        <w:br/>
-        <w:t xml:space="preserve">                    +--------------------+   +------------------------+</w:t>
-      </w:r>
-    </w:p>
+    <w:tbl>
+      <w:tblPr>
+        <w:tblW w:w="9360" w:type="dxa"/>
+        <w:tblBorders>
+          <w:top w:val="nil"/>
+          <w:left w:val="nil"/>
+          <w:bottom w:val="nil"/>
+          <w:right w:val="nil"/>
+          <w:insideH w:val="nil"/>
+          <w:insideV w:val="nil"/>
+        </w:tblBorders>
+        <w:tblLayout w:type="fixed"/>
+      </w:tblPr>
+      <w:tblGrid>
+        <w:gridCol w:w="4680"/>
+        <w:gridCol w:w="4680"/>
+      </w:tblGrid>
+      <w:tr>
+        <w:tc>
+          <w:tcPr>
+            <w:tcW w:w="9360" w:type="dxa"/>
+            <w:gridSpan w:val="2"/>
+            <w:tcBorders>
+              <w:top w:val="single" w:sz="8" w:space="0" w:color="2E74B5"/>
+              <w:left w:val="single" w:sz="8" w:space="0" w:color="2E74B5"/>
+              <w:bottom w:val="single" w:sz="8" w:space="0" w:color="2E74B5"/>
+              <w:right w:val="single" w:sz="8" w:space="0" w:color="2E74B5"/>
+            </w:tcBorders>
+            <w:shd w:val="clear" w:color="auto" w:fill="DBE5F1"/>
+            <w:tcMar>
+              <w:top w:w="100" w:type="dxa"/>
+              <w:bottom w:w="100" w:type="dxa"/>
+              <w:left w:w="120" w:type="dxa"/>
+              <w:right w:w="120" w:type="dxa"/>
+            </w:tcMar>
+            <w:vAlign w:val="center"/>
+          </w:tcPr>
+          <w:p>
+            <w:pPr>
+              <w:jc w:val="center"/>
+              <w:spacing w:after="40" w:line="240" w:lineRule="auto"/>
+            </w:pPr>
+            <w:r>
+              <w:rPr>
+                <w:b/>
+                <w:color w:val="1F3864"/>
+                <w:sz w:val="20"/>
+                <w:szCs w:val="20"/>
+              </w:rPr>
+              <w:t xml:space="preserve">CLIENT  —  Data Owner / User</w:t>
+            </w:r>
+          </w:p>
+          <w:p>
+            <w:pPr>
+              <w:jc w:val="center"/>
+              <w:spacing w:after="20" w:line="240" w:lineRule="auto"/>
+            </w:pPr>
+            <w:r>
+              <w:rPr>
+                <w:sz w:val="16"/>
+                <w:szCs w:val="16"/>
+                <w:color w:val="404040"/>
+              </w:rPr>
+              <w:t xml:space="preserve">AES-256-GCM file encryption   ·   DEK generation</w:t>
+            </w:r>
+          </w:p>
+          <w:p>
+            <w:pPr>
+              <w:jc w:val="center"/>
+              <w:spacing w:after="20" w:line="240" w:lineRule="auto"/>
+            </w:pPr>
+            <w:r>
+              <w:rPr>
+                <w:sz w:val="16"/>
+                <w:szCs w:val="16"/>
+                <w:color w:val="404040"/>
+              </w:rPr>
+              <w:t xml:space="preserve">RSA-OAEP device-key wrap   ·   RSA-PSS signing</w:t>
+            </w:r>
+          </w:p>
+          <w:p>
+            <w:pPr>
+              <w:jc w:val="center"/>
+              <w:spacing w:after="0" w:line="240" w:lineRule="auto"/>
+            </w:pPr>
+            <w:r>
+              <w:rPr>
+                <w:sz w:val="16"/>
+                <w:szCs w:val="16"/>
+                <w:color w:val="404040"/>
+              </w:rPr>
+              <w:t xml:space="preserve">Final (light) CP-ABE decryption step</w:t>
+            </w:r>
+          </w:p>
+        </w:tc>
+      </w:tr>
+      <w:tr>
+        <w:tc>
+          <w:tcPr>
+            <w:tcW w:w="9360" w:type="dxa"/>
+            <w:gridSpan w:val="2"/>
+            <w:tcBorders>
+              <w:top w:val="nil"/>
+              <w:left w:val="nil"/>
+              <w:bottom w:val="nil"/>
+              <w:right w:val="nil"/>
+            </w:tcBorders>
+            <w:vAlign w:val="center"/>
+          </w:tcPr>
+          <w:p>
+            <w:pPr>
+              <w:jc w:val="center"/>
+              <w:spacing w:before="60" w:after="60" w:line="240" w:lineRule="auto"/>
+            </w:pPr>
+            <w:r>
+              <w:rPr>
+                <w:b/>
+                <w:color w:val="2E74B5"/>
+                <w:sz w:val="18"/>
+                <w:szCs w:val="18"/>
+              </w:rPr>
+              <w:t xml:space="preserve">↓  Upload (encrypted file + wrapped DEK)          ↑  Download (transformed ciphertext)</w:t>
+            </w:r>
+          </w:p>
+        </w:tc>
+      </w:tr>
+      <w:tr>
+        <w:tc>
+          <w:tcPr>
+            <w:tcW w:w="4680" w:type="dxa"/>
+            <w:tcBorders>
+              <w:top w:val="single" w:sz="8" w:space="0" w:color="2E74B5"/>
+              <w:left w:val="single" w:sz="8" w:space="0" w:color="2E74B5"/>
+              <w:bottom w:val="single" w:sz="8" w:space="0" w:color="2E74B5"/>
+              <w:right w:val="single" w:sz="8" w:space="0" w:color="2E74B5"/>
+            </w:tcBorders>
+            <w:shd w:val="clear" w:color="auto" w:fill="DBE5F1"/>
+            <w:tcMar>
+              <w:top w:w="100" w:type="dxa"/>
+              <w:bottom w:w="100" w:type="dxa"/>
+              <w:left w:w="120" w:type="dxa"/>
+              <w:right w:w="120" w:type="dxa"/>
+            </w:tcMar>
+            <w:vAlign w:val="center"/>
+          </w:tcPr>
+          <w:p>
+            <w:pPr>
+              <w:jc w:val="center"/>
+              <w:spacing w:after="40" w:line="240" w:lineRule="auto"/>
+            </w:pPr>
+            <w:r>
+              <w:rPr>
+                <w:b/>
+                <w:color w:val="1F3864"/>
+                <w:sz w:val="20"/>
+                <w:szCs w:val="20"/>
+              </w:rPr>
+              <w:t xml:space="preserve">BACKEND  —  Flask REST API</w:t>
+            </w:r>
+          </w:p>
+          <w:p>
+            <w:pPr>
+              <w:jc w:val="center"/>
+              <w:spacing w:after="20" w:line="240" w:lineRule="auto"/>
+            </w:pPr>
+            <w:r>
+              <w:rPr>
+                <w:sz w:val="16"/>
+                <w:szCs w:val="16"/>
+                <w:color w:val="404040"/>
+              </w:rPr>
+              <w:t xml:space="preserve">JWT authentication</w:t>
+            </w:r>
+          </w:p>
+          <w:p>
+            <w:pPr>
+              <w:jc w:val="center"/>
+              <w:spacing w:after="20" w:line="240" w:lineRule="auto"/>
+            </w:pPr>
+            <w:r>
+              <w:rPr>
+                <w:sz w:val="16"/>
+                <w:szCs w:val="16"/>
+                <w:color w:val="404040"/>
+              </w:rPr>
+              <w:t xml:space="preserve">ABAC engine:  PDP · PEP · PIP · PAP</w:t>
+            </w:r>
+          </w:p>
+          <w:p>
+            <w:pPr>
+              <w:jc w:val="center"/>
+              <w:spacing w:after="20" w:line="240" w:lineRule="auto"/>
+            </w:pPr>
+            <w:r>
+              <w:rPr>
+                <w:sz w:val="16"/>
+                <w:szCs w:val="16"/>
+                <w:color w:val="404040"/>
+              </w:rPr>
+              <w:t xml:space="preserve">CP-ABE key-wrap  ·  outsourced decryption</w:t>
+            </w:r>
+          </w:p>
+          <w:p>
+            <w:pPr>
+              <w:jc w:val="center"/>
+              <w:spacing w:after="0" w:line="240" w:lineRule="auto"/>
+            </w:pPr>
+            <w:r>
+              <w:rPr>
+                <w:sz w:val="16"/>
+                <w:szCs w:val="16"/>
+                <w:color w:val="404040"/>
+              </w:rPr>
+              <w:t xml:space="preserve">Revocation: versioning + lazy DEK re-wrap</w:t>
+            </w:r>
+          </w:p>
+        </w:tc>
+        <w:tc>
+          <w:tcPr>
+            <w:tcW w:w="4680" w:type="dxa"/>
+            <w:tcBorders>
+              <w:top w:val="single" w:sz="8" w:space="0" w:color="2E74B5"/>
+              <w:left w:val="single" w:sz="8" w:space="0" w:color="2E74B5"/>
+              <w:bottom w:val="single" w:sz="8" w:space="0" w:color="2E74B5"/>
+              <w:right w:val="single" w:sz="8" w:space="0" w:color="2E74B5"/>
+            </w:tcBorders>
+            <w:shd w:val="clear" w:color="auto" w:fill="DBE5F1"/>
+            <w:tcMar>
+              <w:top w:w="100" w:type="dxa"/>
+              <w:bottom w:w="100" w:type="dxa"/>
+              <w:left w:w="120" w:type="dxa"/>
+              <w:right w:w="120" w:type="dxa"/>
+            </w:tcMar>
+            <w:vAlign w:val="center"/>
+          </w:tcPr>
+          <w:p>
+            <w:pPr>
+              <w:jc w:val="center"/>
+              <w:spacing w:after="40" w:line="240" w:lineRule="auto"/>
+            </w:pPr>
+            <w:r>
+              <w:rPr>
+                <w:b/>
+                <w:color w:val="1F3864"/>
+                <w:sz w:val="20"/>
+                <w:szCs w:val="20"/>
+              </w:rPr>
+              <w:t xml:space="preserve">ATTRIBUTE AUTHORITY (AA)</w:t>
+            </w:r>
+          </w:p>
+          <w:p>
+            <w:pPr>
+              <w:jc w:val="center"/>
+              <w:spacing w:after="20" w:line="240" w:lineRule="auto"/>
+            </w:pPr>
+            <w:r>
+              <w:rPr>
+                <w:sz w:val="16"/>
+                <w:szCs w:val="16"/>
+                <w:color w:val="404040"/>
+              </w:rPr>
+              <w:t xml:space="preserve">CP-ABE global setup</w:t>
+            </w:r>
+          </w:p>
+          <w:p>
+            <w:pPr>
+              <w:jc w:val="center"/>
+              <w:spacing w:after="20" w:line="240" w:lineRule="auto"/>
+            </w:pPr>
+            <w:r>
+              <w:rPr>
+                <w:sz w:val="16"/>
+                <w:szCs w:val="16"/>
+                <w:color w:val="404040"/>
+              </w:rPr>
+              <w:t xml:space="preserve">Attribute-key issuance  →  users</w:t>
+            </w:r>
+          </w:p>
+          <w:p>
+            <w:pPr>
+              <w:jc w:val="center"/>
+              <w:spacing w:after="0" w:line="240" w:lineRule="auto"/>
+            </w:pPr>
+            <w:r>
+              <w:rPr>
+                <w:sz w:val="16"/>
+                <w:szCs w:val="16"/>
+                <w:color w:val="404040"/>
+              </w:rPr>
+              <w:t xml:space="preserve">Key / attribute versioning</w:t>
+            </w:r>
+          </w:p>
+        </w:tc>
+      </w:tr>
+      <w:tr>
+        <w:tc>
+          <w:tcPr>
+            <w:tcW w:w="9360" w:type="dxa"/>
+            <w:gridSpan w:val="2"/>
+            <w:tcBorders>
+              <w:top w:val="nil"/>
+              <w:left w:val="nil"/>
+              <w:bottom w:val="nil"/>
+              <w:right w:val="nil"/>
+            </w:tcBorders>
+            <w:vAlign w:val="center"/>
+          </w:tcPr>
+          <w:p>
+            <w:pPr>
+              <w:jc w:val="center"/>
+              <w:spacing w:before="60" w:after="60" w:line="240" w:lineRule="auto"/>
+            </w:pPr>
+            <w:r>
+              <w:rPr>
+                <w:b/>
+                <w:color w:val="2E74B5"/>
+                <w:sz w:val="18"/>
+                <w:szCs w:val="18"/>
+              </w:rPr>
+              <w:t xml:space="preserve">↓  Backend persists ciphertext, metadata, wrapped keys &amp; audit log</w:t>
+            </w:r>
+          </w:p>
+        </w:tc>
+      </w:tr>
+      <w:tr>
+        <w:tc>
+          <w:tcPr>
+            <w:tcW w:w="4680" w:type="dxa"/>
+            <w:tcBorders>
+              <w:top w:val="single" w:sz="8" w:space="0" w:color="2E74B5"/>
+              <w:left w:val="single" w:sz="8" w:space="0" w:color="2E74B5"/>
+              <w:bottom w:val="single" w:sz="8" w:space="0" w:color="2E74B5"/>
+              <w:right w:val="single" w:sz="8" w:space="0" w:color="2E74B5"/>
+            </w:tcBorders>
+            <w:shd w:val="clear" w:color="auto" w:fill="DBE5F1"/>
+            <w:tcMar>
+              <w:top w:w="100" w:type="dxa"/>
+              <w:bottom w:w="100" w:type="dxa"/>
+              <w:left w:w="120" w:type="dxa"/>
+              <w:right w:w="120" w:type="dxa"/>
+            </w:tcMar>
+            <w:vAlign w:val="center"/>
+          </w:tcPr>
+          <w:p>
+            <w:pPr>
+              <w:jc w:val="center"/>
+              <w:spacing w:after="40" w:line="240" w:lineRule="auto"/>
+            </w:pPr>
+            <w:r>
+              <w:rPr>
+                <w:b/>
+                <w:color w:val="1F3864"/>
+                <w:sz w:val="20"/>
+                <w:szCs w:val="20"/>
+              </w:rPr>
+              <w:t xml:space="preserve">MongoDB  —  Metadata</w:t>
+            </w:r>
+          </w:p>
+          <w:p>
+            <w:pPr>
+              <w:jc w:val="center"/>
+              <w:spacing w:after="20" w:line="240" w:lineRule="auto"/>
+            </w:pPr>
+            <w:r>
+              <w:rPr>
+                <w:sz w:val="16"/>
+                <w:szCs w:val="16"/>
+                <w:color w:val="404040"/>
+              </w:rPr>
+              <w:t xml:space="preserve">Access policies  ·  wrapped keys</w:t>
+            </w:r>
+          </w:p>
+          <w:p>
+            <w:pPr>
+              <w:jc w:val="center"/>
+              <w:spacing w:after="0" w:line="240" w:lineRule="auto"/>
+            </w:pPr>
+            <w:r>
+              <w:rPr>
+                <w:sz w:val="16"/>
+                <w:szCs w:val="16"/>
+                <w:color w:val="404040"/>
+              </w:rPr>
+              <w:t xml:space="preserve">Key versions  ·  audit log</w:t>
+            </w:r>
+          </w:p>
+        </w:tc>
+        <w:tc>
+          <w:tcPr>
+            <w:tcW w:w="4680" w:type="dxa"/>
+            <w:tcBorders>
+              <w:top w:val="single" w:sz="8" w:space="0" w:color="2E74B5"/>
+              <w:left w:val="single" w:sz="8" w:space="0" w:color="2E74B5"/>
+              <w:bottom w:val="single" w:sz="8" w:space="0" w:color="2E74B5"/>
+              <w:right w:val="single" w:sz="8" w:space="0" w:color="2E74B5"/>
+            </w:tcBorders>
+            <w:shd w:val="clear" w:color="auto" w:fill="DBE5F1"/>
+            <w:tcMar>
+              <w:top w:w="100" w:type="dxa"/>
+              <w:bottom w:w="100" w:type="dxa"/>
+              <w:left w:w="120" w:type="dxa"/>
+              <w:right w:w="120" w:type="dxa"/>
+            </w:tcMar>
+            <w:vAlign w:val="center"/>
+          </w:tcPr>
+          <w:p>
+            <w:pPr>
+              <w:jc w:val="center"/>
+              <w:spacing w:after="40" w:line="240" w:lineRule="auto"/>
+            </w:pPr>
+            <w:r>
+              <w:rPr>
+                <w:b/>
+                <w:color w:val="1F3864"/>
+                <w:sz w:val="20"/>
+                <w:szCs w:val="20"/>
+              </w:rPr>
+              <w:t xml:space="preserve">OBJECT STORE  —  AWS S3 / Azure Blob</w:t>
+            </w:r>
+          </w:p>
+          <w:p>
+            <w:pPr>
+              <w:jc w:val="center"/>
+              <w:spacing w:after="20" w:line="240" w:lineRule="auto"/>
+            </w:pPr>
+            <w:r>
+              <w:rPr>
+                <w:sz w:val="16"/>
+                <w:szCs w:val="16"/>
+                <w:color w:val="404040"/>
+              </w:rPr>
+              <w:t xml:space="preserve">Encrypted file objects</w:t>
+            </w:r>
+          </w:p>
+          <w:p>
+            <w:pPr>
+              <w:jc w:val="center"/>
+              <w:spacing w:after="0" w:line="240" w:lineRule="auto"/>
+            </w:pPr>
+            <w:r>
+              <w:rPr>
+                <w:sz w:val="16"/>
+                <w:szCs w:val="16"/>
+                <w:color w:val="404040"/>
+              </w:rPr>
+              <w:t xml:space="preserve">Accessed via presigned URLs</w:t>
+            </w:r>
+          </w:p>
+        </w:tc>
+      </w:tr>
+    </w:tbl>
+    <w:p/>
     <w:p>
       <w:pPr>
         <w:pStyle w:val="Heading3"/>
@@ -2966,45 +3355,363 @@
         <w:t xml:space="preserve">Figure 2 — Three-Tier Key Hierarchy</w:t>
       </w:r>
     </w:p>
-    <w:p>
-      <w:pPr>
-        <w:pStyle w:val="Normal"/>
-        <w:spacing w:after="120" w:line="240" w:lineRule="auto"/>
-        <w:shd w:val="clear" w:fill="F2F2F2"/>
-      </w:pPr>
-      <w:r>
-        <w:rPr>
-          <w:rFonts w:ascii="Consolas" w:hAnsi="Consolas" w:cs="Consolas"/>
-          <w:sz w:val="16"/>
-          <w:szCs w:val="16"/>
-        </w:rPr>
-        <w:t xml:space="preserve">   File plaintext</w:t>
-        <w:br/>
-        <w:t xml:space="preserve">        |  AES-256-GCM</w:t>
-        <w:br/>
-        <w:t xml:space="preserve">        v</w:t>
-        <w:br/>
-        <w:t xml:space="preserve">   Data-Encryption Key (DEK, 256-bit)</w:t>
-        <w:br/>
-        <w:t xml:space="preserve">        |  Tier 1: wrap under CP-ABE access policy</w:t>
-        <w:br/>
-        <w:t xml:space="preserve">        v</w:t>
-        <w:br/>
-        <w:t xml:space="preserve">   CP-ABE-wrapped DEK  (attribute-based authorisation)</w:t>
-        <w:br/>
-        <w:t xml:space="preserve">        |  Tier 2: wrap under per-user RSA-OAEP public key</w:t>
-        <w:br/>
-        <w:t xml:space="preserve">        v</w:t>
-        <w:br/>
-        <w:t xml:space="preserve">   RSA-wrapped DEK     (device / user binding)</w:t>
-        <w:br/>
-        <w:t xml:space="preserve">        |  Tier 3 (integrity): SHA-256 + RSA-PSS signature</w:t>
-        <w:br/>
-        <w:t xml:space="preserve">        v</w:t>
-        <w:br/>
-        <w:t xml:space="preserve">   Stored ciphertext + wrapped keys + signature</w:t>
-      </w:r>
-    </w:p>
+    <w:tbl>
+      <w:tblPr>
+        <w:tblW w:w="6000" w:type="dxa"/>
+        <w:jc w:val="center"/>
+        <w:tblBorders>
+          <w:top w:val="nil"/>
+          <w:left w:val="nil"/>
+          <w:bottom w:val="nil"/>
+          <w:right w:val="nil"/>
+          <w:insideH w:val="nil"/>
+          <w:insideV w:val="nil"/>
+        </w:tblBorders>
+        <w:tblLayout w:type="fixed"/>
+      </w:tblPr>
+      <w:tblGrid>
+        <w:gridCol w:w="6000"/>
+      </w:tblGrid>
+      <w:tr>
+        <w:tc>
+          <w:tcPr>
+            <w:tcW w:w="6000" w:type="dxa"/>
+            <w:tcBorders>
+              <w:top w:val="single" w:sz="8" w:space="0" w:color="2E74B5"/>
+              <w:left w:val="single" w:sz="8" w:space="0" w:color="2E74B5"/>
+              <w:bottom w:val="single" w:sz="8" w:space="0" w:color="2E74B5"/>
+              <w:right w:val="single" w:sz="8" w:space="0" w:color="2E74B5"/>
+            </w:tcBorders>
+            <w:shd w:val="clear" w:color="auto" w:fill="DBE5F1"/>
+            <w:tcMar>
+              <w:top w:w="100" w:type="dxa"/>
+              <w:bottom w:w="100" w:type="dxa"/>
+              <w:left w:w="120" w:type="dxa"/>
+              <w:right w:w="120" w:type="dxa"/>
+            </w:tcMar>
+            <w:vAlign w:val="center"/>
+          </w:tcPr>
+          <w:p>
+            <w:pPr>
+              <w:jc w:val="center"/>
+              <w:spacing w:after="0" w:line="240" w:lineRule="auto"/>
+            </w:pPr>
+            <w:r>
+              <w:rPr>
+                <w:b/>
+                <w:color w:val="1F3864"/>
+                <w:sz w:val="20"/>
+                <w:szCs w:val="20"/>
+              </w:rPr>
+              <w:t xml:space="preserve">File  (plaintext)</w:t>
+            </w:r>
+          </w:p>
+        </w:tc>
+      </w:tr>
+      <w:tr>
+        <w:tc>
+          <w:tcPr>
+            <w:tcW w:w="6000" w:type="dxa"/>
+            <w:tcBorders>
+              <w:top w:val="nil"/>
+              <w:left w:val="nil"/>
+              <w:bottom w:val="nil"/>
+              <w:right w:val="nil"/>
+            </w:tcBorders>
+            <w:vAlign w:val="center"/>
+          </w:tcPr>
+          <w:p>
+            <w:pPr>
+              <w:jc w:val="center"/>
+              <w:spacing w:before="60" w:after="60" w:line="240" w:lineRule="auto"/>
+            </w:pPr>
+            <w:r>
+              <w:rPr>
+                <w:b/>
+                <w:color w:val="2E74B5"/>
+                <w:sz w:val="18"/>
+                <w:szCs w:val="18"/>
+              </w:rPr>
+              <w:t xml:space="preserve">↓   AES-256-GCM encryption</w:t>
+            </w:r>
+          </w:p>
+        </w:tc>
+      </w:tr>
+      <w:tr>
+        <w:tc>
+          <w:tcPr>
+            <w:tcW w:w="6000" w:type="dxa"/>
+            <w:tcBorders>
+              <w:top w:val="single" w:sz="8" w:space="0" w:color="2E74B5"/>
+              <w:left w:val="single" w:sz="8" w:space="0" w:color="2E74B5"/>
+              <w:bottom w:val="single" w:sz="8" w:space="0" w:color="2E74B5"/>
+              <w:right w:val="single" w:sz="8" w:space="0" w:color="2E74B5"/>
+            </w:tcBorders>
+            <w:shd w:val="clear" w:color="auto" w:fill="DBE5F1"/>
+            <w:tcMar>
+              <w:top w:w="100" w:type="dxa"/>
+              <w:bottom w:w="100" w:type="dxa"/>
+              <w:left w:w="120" w:type="dxa"/>
+              <w:right w:w="120" w:type="dxa"/>
+            </w:tcMar>
+            <w:vAlign w:val="center"/>
+          </w:tcPr>
+          <w:p>
+            <w:pPr>
+              <w:jc w:val="center"/>
+              <w:spacing w:after="40" w:line="240" w:lineRule="auto"/>
+            </w:pPr>
+            <w:r>
+              <w:rPr>
+                <w:b/>
+                <w:color w:val="1F3864"/>
+                <w:sz w:val="20"/>
+                <w:szCs w:val="20"/>
+              </w:rPr>
+              <w:t xml:space="preserve">Data-Encryption Key (DEK)</w:t>
+            </w:r>
+          </w:p>
+          <w:p>
+            <w:pPr>
+              <w:jc w:val="center"/>
+              <w:spacing w:after="0" w:line="240" w:lineRule="auto"/>
+            </w:pPr>
+            <w:r>
+              <w:rPr>
+                <w:sz w:val="16"/>
+                <w:szCs w:val="16"/>
+                <w:color w:val="404040"/>
+              </w:rPr>
+              <w:t xml:space="preserve">256-bit symmetric key</w:t>
+            </w:r>
+          </w:p>
+        </w:tc>
+      </w:tr>
+      <w:tr>
+        <w:tc>
+          <w:tcPr>
+            <w:tcW w:w="6000" w:type="dxa"/>
+            <w:tcBorders>
+              <w:top w:val="nil"/>
+              <w:left w:val="nil"/>
+              <w:bottom w:val="nil"/>
+              <w:right w:val="nil"/>
+            </w:tcBorders>
+            <w:vAlign w:val="center"/>
+          </w:tcPr>
+          <w:p>
+            <w:pPr>
+              <w:jc w:val="center"/>
+              <w:spacing w:before="60" w:after="60" w:line="240" w:lineRule="auto"/>
+            </w:pPr>
+            <w:r>
+              <w:rPr>
+                <w:b/>
+                <w:color w:val="2E74B5"/>
+                <w:sz w:val="18"/>
+                <w:szCs w:val="18"/>
+              </w:rPr>
+              <w:t xml:space="preserve">↓   Tier 1 — wrap under CP-ABE access policy</w:t>
+            </w:r>
+          </w:p>
+        </w:tc>
+      </w:tr>
+      <w:tr>
+        <w:tc>
+          <w:tcPr>
+            <w:tcW w:w="6000" w:type="dxa"/>
+            <w:tcBorders>
+              <w:top w:val="single" w:sz="8" w:space="0" w:color="2E74B5"/>
+              <w:left w:val="single" w:sz="8" w:space="0" w:color="2E74B5"/>
+              <w:bottom w:val="single" w:sz="8" w:space="0" w:color="2E74B5"/>
+              <w:right w:val="single" w:sz="8" w:space="0" w:color="2E74B5"/>
+            </w:tcBorders>
+            <w:shd w:val="clear" w:color="auto" w:fill="DBE5F1"/>
+            <w:tcMar>
+              <w:top w:w="100" w:type="dxa"/>
+              <w:bottom w:w="100" w:type="dxa"/>
+              <w:left w:w="120" w:type="dxa"/>
+              <w:right w:w="120" w:type="dxa"/>
+            </w:tcMar>
+            <w:vAlign w:val="center"/>
+          </w:tcPr>
+          <w:p>
+            <w:pPr>
+              <w:jc w:val="center"/>
+              <w:spacing w:after="40" w:line="240" w:lineRule="auto"/>
+            </w:pPr>
+            <w:r>
+              <w:rPr>
+                <w:b/>
+                <w:color w:val="1F3864"/>
+                <w:sz w:val="20"/>
+                <w:szCs w:val="20"/>
+              </w:rPr>
+              <w:t xml:space="preserve">CP-ABE-wrapped DEK</w:t>
+            </w:r>
+          </w:p>
+          <w:p>
+            <w:pPr>
+              <w:jc w:val="center"/>
+              <w:spacing w:after="0" w:line="240" w:lineRule="auto"/>
+            </w:pPr>
+            <w:r>
+              <w:rPr>
+                <w:sz w:val="16"/>
+                <w:szCs w:val="16"/>
+                <w:color w:val="404040"/>
+              </w:rPr>
+              <w:t xml:space="preserve">attribute-based authorisation</w:t>
+            </w:r>
+          </w:p>
+        </w:tc>
+      </w:tr>
+      <w:tr>
+        <w:tc>
+          <w:tcPr>
+            <w:tcW w:w="6000" w:type="dxa"/>
+            <w:tcBorders>
+              <w:top w:val="nil"/>
+              <w:left w:val="nil"/>
+              <w:bottom w:val="nil"/>
+              <w:right w:val="nil"/>
+            </w:tcBorders>
+            <w:vAlign w:val="center"/>
+          </w:tcPr>
+          <w:p>
+            <w:pPr>
+              <w:jc w:val="center"/>
+              <w:spacing w:before="60" w:after="60" w:line="240" w:lineRule="auto"/>
+            </w:pPr>
+            <w:r>
+              <w:rPr>
+                <w:b/>
+                <w:color w:val="2E74B5"/>
+                <w:sz w:val="18"/>
+                <w:szCs w:val="18"/>
+              </w:rPr>
+              <w:t xml:space="preserve">↓   Tier 2 — wrap under per-user RSA-OAEP public key</w:t>
+            </w:r>
+          </w:p>
+        </w:tc>
+      </w:tr>
+      <w:tr>
+        <w:tc>
+          <w:tcPr>
+            <w:tcW w:w="6000" w:type="dxa"/>
+            <w:tcBorders>
+              <w:top w:val="single" w:sz="8" w:space="0" w:color="2E74B5"/>
+              <w:left w:val="single" w:sz="8" w:space="0" w:color="2E74B5"/>
+              <w:bottom w:val="single" w:sz="8" w:space="0" w:color="2E74B5"/>
+              <w:right w:val="single" w:sz="8" w:space="0" w:color="2E74B5"/>
+            </w:tcBorders>
+            <w:shd w:val="clear" w:color="auto" w:fill="DBE5F1"/>
+            <w:tcMar>
+              <w:top w:w="100" w:type="dxa"/>
+              <w:bottom w:w="100" w:type="dxa"/>
+              <w:left w:w="120" w:type="dxa"/>
+              <w:right w:w="120" w:type="dxa"/>
+            </w:tcMar>
+            <w:vAlign w:val="center"/>
+          </w:tcPr>
+          <w:p>
+            <w:pPr>
+              <w:jc w:val="center"/>
+              <w:spacing w:after="40" w:line="240" w:lineRule="auto"/>
+            </w:pPr>
+            <w:r>
+              <w:rPr>
+                <w:b/>
+                <w:color w:val="1F3864"/>
+                <w:sz w:val="20"/>
+                <w:szCs w:val="20"/>
+              </w:rPr>
+              <w:t xml:space="preserve">RSA-wrapped DEK</w:t>
+            </w:r>
+          </w:p>
+          <w:p>
+            <w:pPr>
+              <w:jc w:val="center"/>
+              <w:spacing w:after="0" w:line="240" w:lineRule="auto"/>
+            </w:pPr>
+            <w:r>
+              <w:rPr>
+                <w:sz w:val="16"/>
+                <w:szCs w:val="16"/>
+                <w:color w:val="404040"/>
+              </w:rPr>
+              <w:t xml:space="preserve">device / user binding</w:t>
+            </w:r>
+          </w:p>
+        </w:tc>
+      </w:tr>
+      <w:tr>
+        <w:tc>
+          <w:tcPr>
+            <w:tcW w:w="6000" w:type="dxa"/>
+            <w:tcBorders>
+              <w:top w:val="nil"/>
+              <w:left w:val="nil"/>
+              <w:bottom w:val="nil"/>
+              <w:right w:val="nil"/>
+            </w:tcBorders>
+            <w:vAlign w:val="center"/>
+          </w:tcPr>
+          <w:p>
+            <w:pPr>
+              <w:jc w:val="center"/>
+              <w:spacing w:before="60" w:after="60" w:line="240" w:lineRule="auto"/>
+            </w:pPr>
+            <w:r>
+              <w:rPr>
+                <w:b/>
+                <w:color w:val="2E74B5"/>
+                <w:sz w:val="18"/>
+                <w:szCs w:val="18"/>
+              </w:rPr>
+              <w:t xml:space="preserve">↓   Tier 3 — SHA-256 hash + RSA-PSS signature (integrity)</w:t>
+            </w:r>
+          </w:p>
+        </w:tc>
+      </w:tr>
+      <w:tr>
+        <w:tc>
+          <w:tcPr>
+            <w:tcW w:w="6000" w:type="dxa"/>
+            <w:tcBorders>
+              <w:top w:val="single" w:sz="8" w:space="0" w:color="2E74B5"/>
+              <w:left w:val="single" w:sz="8" w:space="0" w:color="2E74B5"/>
+              <w:bottom w:val="single" w:sz="8" w:space="0" w:color="2E74B5"/>
+              <w:right w:val="single" w:sz="8" w:space="0" w:color="2E74B5"/>
+            </w:tcBorders>
+            <w:shd w:val="clear" w:color="auto" w:fill="DBE5F1"/>
+            <w:tcMar>
+              <w:top w:w="100" w:type="dxa"/>
+              <w:bottom w:w="100" w:type="dxa"/>
+              <w:left w:w="120" w:type="dxa"/>
+              <w:right w:w="120" w:type="dxa"/>
+            </w:tcMar>
+            <w:vAlign w:val="center"/>
+          </w:tcPr>
+          <w:p>
+            <w:pPr>
+              <w:jc w:val="center"/>
+              <w:spacing w:after="0" w:line="240" w:lineRule="auto"/>
+            </w:pPr>
+            <w:r>
+              <w:rPr>
+                <w:b/>
+                <w:color w:val="1F3864"/>
+                <w:sz w:val="20"/>
+                <w:szCs w:val="20"/>
+              </w:rPr>
+              <w:t xml:space="preserve">Stored ciphertext  +  wrapped keys  +  signature</w:t>
+            </w:r>
+          </w:p>
+        </w:tc>
+      </w:tr>
+    </w:tbl>
+    <w:p/>
     <w:p>
       <w:pPr>
         <w:pStyle w:val="Heading1"/>

</xml_diff>